<commit_message>
gestion des erreurs et aerationdu template
</commit_message>
<xml_diff>
--- a/templates/template_om_avec_balises.docx
+++ b/templates/template_om_avec_balises.docx
@@ -236,17 +236,15 @@
       <w:pPr>
         <w:pStyle w:val="Normal"/>
         <w:rPr>
-          <w:rFonts w:ascii="Arial" w:hAnsi="Arial" w:cs="Arial"/>
-          <w:sz w:val="22"/>
-          <w:szCs w:val="22"/>
-          <w:lang w:val="en-US"/>
+          <w:sz w:val="21"/>
+          <w:szCs w:val="21"/>
         </w:rPr>
       </w:pPr>
       <w:r>
         <w:rPr>
           <w:rFonts w:cs="Arial" w:ascii="Imprint MT Shadow" w:hAnsi="Imprint MT Shadow"/>
-          <w:sz w:val="22"/>
-          <w:szCs w:val="22"/>
+          <w:sz w:val="21"/>
+          <w:szCs w:val="21"/>
           <w:lang w:val="en-US"/>
         </w:rPr>
         <w:t>M.</w:t>
@@ -254,8 +252,8 @@
       <w:r>
         <w:rPr>
           <w:rFonts w:cs="Arial" w:ascii="Arial" w:hAnsi="Arial"/>
-          <w:sz w:val="22"/>
-          <w:szCs w:val="22"/>
+          <w:sz w:val="21"/>
+          <w:szCs w:val="21"/>
           <w:lang w:val="en-US"/>
         </w:rPr>
         <w:t xml:space="preserve"> {nom}</w:t>
@@ -269,21 +267,16 @@
           <w:tab w:val="left" w:pos="2280" w:leader="none"/>
         </w:tabs>
         <w:rPr>
-          <w:rFonts w:ascii="Arial" w:hAnsi="Arial" w:cs="Arial"/>
-          <w:b/>
-          <w:b/>
-          <w:i/>
-          <w:i/>
-          <w:sz w:val="18"/>
-          <w:szCs w:val="18"/>
+          <w:sz w:val="21"/>
+          <w:szCs w:val="21"/>
         </w:rPr>
       </w:pPr>
       <w:r>
         <w:rPr>
           <w:rFonts w:cs="Arial" w:ascii="Arial" w:hAnsi="Arial"/>
           <w:b/>
-          <w:sz w:val="18"/>
-          <w:szCs w:val="18"/>
+          <w:sz w:val="21"/>
+          <w:szCs w:val="21"/>
         </w:rPr>
         <w:t xml:space="preserve">Nom – </w:t>
       </w:r>
@@ -292,8 +285,8 @@
           <w:rFonts w:cs="Arial" w:ascii="Arial" w:hAnsi="Arial"/>
           <w:b/>
           <w:i/>
-          <w:sz w:val="18"/>
-          <w:szCs w:val="18"/>
+          <w:sz w:val="21"/>
+          <w:szCs w:val="21"/>
         </w:rPr>
         <w:t>Name</w:t>
         <w:tab/>
@@ -307,19 +300,16 @@
           <w:tab w:val="left" w:pos="2280" w:leader="none"/>
         </w:tabs>
         <w:rPr>
-          <w:rFonts w:ascii="Arial" w:hAnsi="Arial" w:cs="Arial"/>
-          <w:b/>
-          <w:b/>
-          <w:sz w:val="18"/>
-          <w:szCs w:val="18"/>
+          <w:sz w:val="21"/>
+          <w:szCs w:val="21"/>
         </w:rPr>
       </w:pPr>
       <w:r>
         <w:rPr>
           <w:rFonts w:cs="Arial" w:ascii="Arial" w:hAnsi="Arial"/>
           <w:b/>
-          <w:sz w:val="18"/>
-          <w:szCs w:val="18"/>
+          <w:sz w:val="21"/>
+          <w:szCs w:val="21"/>
         </w:rPr>
         <w:tab/>
       </w:r>
@@ -328,16 +318,15 @@
       <w:pPr>
         <w:pStyle w:val="Normal"/>
         <w:rPr>
-          <w:rFonts w:ascii="Arial" w:hAnsi="Arial" w:cs="Arial"/>
-          <w:sz w:val="20"/>
-          <w:szCs w:val="20"/>
+          <w:sz w:val="21"/>
+          <w:szCs w:val="21"/>
         </w:rPr>
       </w:pPr>
       <w:r>
         <w:rPr>
           <w:rFonts w:cs="Arial" w:ascii="Arial" w:hAnsi="Arial"/>
-          <w:sz w:val="22"/>
-          <w:szCs w:val="22"/>
+          <w:sz w:val="21"/>
+          <w:szCs w:val="21"/>
         </w:rPr>
         <w:t>{prenoms}</w:t>
       </w:r>
@@ -346,21 +335,16 @@
       <w:pPr>
         <w:pStyle w:val="Normal"/>
         <w:rPr>
-          <w:rFonts w:ascii="Arial" w:hAnsi="Arial" w:cs="Arial"/>
-          <w:b/>
-          <w:b/>
-          <w:i/>
-          <w:i/>
-          <w:sz w:val="18"/>
-          <w:szCs w:val="18"/>
+          <w:sz w:val="21"/>
+          <w:szCs w:val="21"/>
         </w:rPr>
       </w:pPr>
       <w:r>
         <w:rPr>
           <w:rFonts w:cs="Arial" w:ascii="Arial" w:hAnsi="Arial"/>
           <w:b/>
-          <w:sz w:val="18"/>
-          <w:szCs w:val="18"/>
+          <w:sz w:val="21"/>
+          <w:szCs w:val="21"/>
         </w:rPr>
         <w:t xml:space="preserve">Prénoms – </w:t>
       </w:r>
@@ -369,8 +353,8 @@
           <w:rFonts w:cs="Arial" w:ascii="Arial" w:hAnsi="Arial"/>
           <w:b/>
           <w:i/>
-          <w:sz w:val="18"/>
-          <w:szCs w:val="18"/>
+          <w:sz w:val="21"/>
+          <w:szCs w:val="21"/>
         </w:rPr>
         <w:t>First Names</w:t>
       </w:r>
@@ -382,16 +366,16 @@
           <w:rFonts w:ascii="Arial" w:hAnsi="Arial" w:cs="Arial"/>
           <w:b/>
           <w:b/>
-          <w:sz w:val="18"/>
-          <w:szCs w:val="18"/>
+          <w:sz w:val="21"/>
+          <w:szCs w:val="21"/>
         </w:rPr>
       </w:pPr>
       <w:r>
         <w:rPr>
           <w:rFonts w:cs="Arial" w:ascii="Arial" w:hAnsi="Arial"/>
           <w:b/>
-          <w:sz w:val="18"/>
-          <w:szCs w:val="18"/>
+          <w:sz w:val="21"/>
+          <w:szCs w:val="21"/>
         </w:rPr>
       </w:r>
     </w:p>
@@ -399,18 +383,14 @@
       <w:pPr>
         <w:pStyle w:val="Normal"/>
         <w:rPr>
-          <w:b/>
-          <w:b/>
-          <w:i/>
-          <w:i/>
-          <w:sz w:val="18"/>
-          <w:szCs w:val="18"/>
+          <w:sz w:val="21"/>
+          <w:szCs w:val="21"/>
         </w:rPr>
       </w:pPr>
       <w:r>
         <w:rPr>
-          <w:sz w:val="20"/>
-          <w:szCs w:val="20"/>
+          <w:sz w:val="21"/>
+          <w:szCs w:val="21"/>
         </w:rPr>
         <w:t>Grade : {grade}Affectation : {affectation}</w:t>
       </w:r>
@@ -419,14 +399,14 @@
       <w:pPr>
         <w:pStyle w:val="Normal"/>
         <w:rPr>
-          <w:sz w:val="20"/>
-          <w:szCs w:val="20"/>
+          <w:sz w:val="21"/>
+          <w:szCs w:val="21"/>
         </w:rPr>
       </w:pPr>
       <w:r>
         <w:rPr>
-          <w:sz w:val="20"/>
-          <w:szCs w:val="20"/>
+          <w:sz w:val="21"/>
+          <w:szCs w:val="21"/>
         </w:rPr>
         <w:t xml:space="preserve">        </w:t>
       </w:r>
@@ -435,70 +415,70 @@
       <w:pPr>
         <w:pStyle w:val="Normal"/>
         <w:rPr>
-          <w:sz w:val="20"/>
-          <w:szCs w:val="20"/>
+          <w:sz w:val="21"/>
+          <w:szCs w:val="21"/>
         </w:rPr>
       </w:pPr>
       <w:r>
         <w:rPr>
-          <w:sz w:val="20"/>
-          <w:szCs w:val="20"/>
+          <w:sz w:val="21"/>
+          <w:szCs w:val="21"/>
         </w:rPr>
         <w:t xml:space="preserve">Matricule : </w:t>
       </w:r>
       <w:r>
         <w:rPr>
           <w:rFonts w:cs="Tahoma" w:ascii="Tahoma" w:hAnsi="Tahoma"/>
-          <w:sz w:val="20"/>
-          <w:szCs w:val="20"/>
+          <w:sz w:val="21"/>
+          <w:szCs w:val="21"/>
         </w:rPr>
         <w:t>{matricule}</w:t>
       </w:r>
       <w:r>
         <w:rPr>
-          <w:sz w:val="20"/>
-          <w:szCs w:val="20"/>
-        </w:rPr>
-        <w:t>. Situation de famille : {situationFamille} Indice {indice}</w:t>
+          <w:sz w:val="21"/>
+          <w:szCs w:val="21"/>
+        </w:rPr>
+        <w:t xml:space="preserve">.  </w:t>
+        <w:tab/>
+        <w:tab/>
+        <w:t xml:space="preserve">Situation de famille : {situationFamille} </w:t>
+        <w:tab/>
+        <w:tab/>
+        <w:t>Indice {indice}</w:t>
       </w:r>
     </w:p>
     <w:p>
       <w:pPr>
         <w:pStyle w:val="Normal"/>
         <w:rPr>
-          <w:i/>
-          <w:i/>
-          <w:sz w:val="18"/>
-          <w:szCs w:val="18"/>
-          <w:lang w:val="en-US"/>
+          <w:sz w:val="21"/>
+          <w:szCs w:val="21"/>
         </w:rPr>
       </w:pPr>
       <w:r>
         <w:rPr>
           <w:i/>
-          <w:sz w:val="18"/>
-          <w:szCs w:val="18"/>
+          <w:sz w:val="21"/>
+          <w:szCs w:val="21"/>
           <w:lang w:val="en-US"/>
         </w:rPr>
-        <w:t>Service number                                                          Family situation                                                                      Index</w:t>
+        <w:t>Service number                                           Family situation                                                       Index</w:t>
       </w:r>
     </w:p>
     <w:p>
       <w:pPr>
         <w:pStyle w:val="Normal"/>
         <w:rPr>
-          <w:i/>
-          <w:i/>
-          <w:sz w:val="18"/>
-          <w:szCs w:val="18"/>
-          <w:lang w:val="en-US"/>
+          <w:sz w:val="21"/>
+          <w:szCs w:val="21"/>
         </w:rPr>
       </w:pPr>
       <w:r>
         <w:rPr>
           <w:i/>
-          <w:sz w:val="18"/>
-          <w:szCs w:val="18"/>
+          <w:sz w:val="21"/>
+          <w:szCs w:val="21"/>
           <w:lang w:val="en-US"/>
         </w:rPr>
         <w:t xml:space="preserve"> </w:t>
@@ -508,23 +488,27 @@
       <w:pPr>
         <w:pStyle w:val="Normal"/>
         <w:rPr>
-          <w:sz w:val="20"/>
-          <w:szCs w:val="20"/>
+          <w:sz w:val="21"/>
+          <w:szCs w:val="21"/>
         </w:rPr>
       </w:pPr>
       <w:r>
         <w:rPr>
-          <w:sz w:val="20"/>
-          <w:szCs w:val="20"/>
-        </w:rPr>
-        <w:t xml:space="preserve">Se rendra à : {destination} en passant par : </w:t>
+          <w:sz w:val="21"/>
+          <w:szCs w:val="21"/>
+        </w:rPr>
+        <w:t xml:space="preserve">Se rendra à : {destination} </w:t>
+        <w:tab/>
+        <w:tab/>
+        <w:tab/>
+        <w:t xml:space="preserve">            en passant par : </w:t>
       </w:r>
       <w:r>
         <w:rPr>
           <w:b/>
           <w:bCs/>
-          <w:sz w:val="20"/>
-          <w:szCs w:val="20"/>
+          <w:sz w:val="21"/>
+          <w:szCs w:val="21"/>
         </w:rPr>
         <w:t>{viaPassage}</w:t>
       </w:r>
@@ -533,17 +517,15 @@
       <w:pPr>
         <w:pStyle w:val="Normal"/>
         <w:rPr>
-          <w:i/>
-          <w:i/>
-          <w:sz w:val="18"/>
-          <w:szCs w:val="18"/>
+          <w:sz w:val="21"/>
+          <w:szCs w:val="21"/>
         </w:rPr>
       </w:pPr>
       <w:r>
         <w:rPr>
           <w:i/>
-          <w:sz w:val="18"/>
-          <w:szCs w:val="18"/>
+          <w:sz w:val="21"/>
+          <w:szCs w:val="21"/>
         </w:rPr>
         <w:t>Will visit                                                                               via</w:t>
       </w:r>
@@ -554,15 +536,15 @@
         <w:rPr>
           <w:i/>
           <w:i/>
-          <w:sz w:val="18"/>
-          <w:szCs w:val="18"/>
+          <w:sz w:val="21"/>
+          <w:szCs w:val="21"/>
         </w:rPr>
       </w:pPr>
       <w:r>
         <w:rPr>
           <w:i/>
-          <w:sz w:val="18"/>
-          <w:szCs w:val="18"/>
+          <w:sz w:val="21"/>
+          <w:szCs w:val="21"/>
         </w:rPr>
       </w:r>
     </w:p>
@@ -570,42 +552,21 @@
       <w:pPr>
         <w:pStyle w:val="Normal"/>
         <w:rPr>
-          <w:sz w:val="20"/>
-          <w:szCs w:val="20"/>
+          <w:sz w:val="21"/>
+          <w:szCs w:val="21"/>
         </w:rPr>
       </w:pPr>
       <w:r>
         <w:rPr>
-          <w:sz w:val="20"/>
-          <w:szCs w:val="20"/>
+          <w:sz w:val="21"/>
+          <w:szCs w:val="21"/>
         </w:rPr>
         <w:t xml:space="preserve">Motif et références : </w:t>
       </w:r>
-    </w:p>
-    <w:p>
-      <w:pPr>
-        <w:pStyle w:val="Normal"/>
-        <w:rPr>
-          <w:i/>
-          <w:i/>
-          <w:sz w:val="18"/>
-          <w:szCs w:val="18"/>
-          <w:lang w:val="en-US"/>
-        </w:rPr>
-      </w:pPr>
       <w:r>
         <w:rPr>
-          <w:i/>
-          <w:sz w:val="18"/>
-          <w:szCs w:val="18"/>
-          <w:lang w:val="en-US"/>
-        </w:rPr>
-        <w:t xml:space="preserve">Purpose and references </w:t>
-      </w:r>
-      <w:r>
-        <w:rPr>
-          <w:sz w:val="20"/>
-          <w:szCs w:val="20"/>
+          <w:sz w:val="21"/>
+          <w:szCs w:val="21"/>
           <w:lang w:val="en-US"/>
         </w:rPr>
         <w:t>{motif}</w:t>
@@ -615,37 +576,54 @@
       <w:pPr>
         <w:pStyle w:val="Normal"/>
         <w:rPr>
-          <w:i/>
-          <w:i/>
-          <w:sz w:val="18"/>
-          <w:szCs w:val="18"/>
-          <w:lang w:val="en-US"/>
+          <w:sz w:val="21"/>
+          <w:szCs w:val="21"/>
         </w:rPr>
       </w:pPr>
       <w:r>
         <w:rPr>
           <w:i/>
-          <w:sz w:val="18"/>
-          <w:szCs w:val="18"/>
+          <w:sz w:val="21"/>
+          <w:szCs w:val="21"/>
           <w:lang w:val="en-US"/>
         </w:rPr>
+        <w:t xml:space="preserve">Purpose and references </w:t>
       </w:r>
     </w:p>
     <w:p>
       <w:pPr>
         <w:pStyle w:val="Normal"/>
         <w:rPr>
-          <w:rFonts w:ascii="Tahoma" w:hAnsi="Tahoma" w:cs="Tahoma"/>
-          <w:b/>
-          <w:b/>
+          <w:i/>
+          <w:i/>
+          <w:sz w:val="21"/>
+          <w:szCs w:val="21"/>
+          <w:lang w:val="en-US"/>
         </w:rPr>
       </w:pPr>
       <w:r>
         <w:rPr>
+          <w:i/>
+          <w:sz w:val="21"/>
+          <w:szCs w:val="21"/>
+          <w:lang w:val="en-US"/>
+        </w:rPr>
+      </w:r>
+    </w:p>
+    <w:p>
+      <w:pPr>
+        <w:pStyle w:val="Normal"/>
+        <w:rPr>
+          <w:sz w:val="21"/>
+          <w:szCs w:val="21"/>
+        </w:rPr>
+      </w:pPr>
+      <w:r>
+        <w:rPr>
           <w:rFonts w:cs="Tahoma" w:ascii="Tahoma" w:hAnsi="Tahoma"/>
           <w:b/>
-          <w:sz w:val="20"/>
-          <w:szCs w:val="20"/>
+          <w:sz w:val="21"/>
+          <w:szCs w:val="21"/>
           <w:lang w:val="en-US"/>
         </w:rPr>
         <w:t xml:space="preserve"> </w:t>
@@ -653,8 +631,8 @@
       <w:r>
         <w:rPr>
           <w:rFonts w:cs="Tahoma" w:ascii="Tahoma" w:hAnsi="Tahoma"/>
-          <w:sz w:val="20"/>
-          <w:szCs w:val="20"/>
+          <w:sz w:val="21"/>
+          <w:szCs w:val="21"/>
         </w:rPr>
         <w:t>Financement :</w:t>
       </w:r>
@@ -662,14 +640,16 @@
         <w:rPr>
           <w:rFonts w:cs="Tahoma" w:ascii="Tahoma" w:hAnsi="Tahoma"/>
           <w:b/>
-          <w:sz w:val="20"/>
-          <w:szCs w:val="20"/>
+          <w:sz w:val="21"/>
+          <w:szCs w:val="21"/>
         </w:rPr>
         <w:t xml:space="preserve"> </w:t>
       </w:r>
       <w:r>
         <w:rPr>
           <w:rFonts w:cs="Tahoma" w:ascii="Tahoma" w:hAnsi="Tahoma"/>
+          <w:sz w:val="21"/>
+          <w:szCs w:val="21"/>
         </w:rPr>
         <w:t>{financement}</w:t>
       </w:r>
@@ -678,17 +658,15 @@
       <w:pPr>
         <w:pStyle w:val="Normal"/>
         <w:rPr>
-          <w:i/>
-          <w:i/>
-          <w:sz w:val="18"/>
-          <w:szCs w:val="18"/>
+          <w:sz w:val="21"/>
+          <w:szCs w:val="21"/>
         </w:rPr>
       </w:pPr>
       <w:r>
         <w:rPr>
           <w:i/>
-          <w:sz w:val="18"/>
-          <w:szCs w:val="18"/>
+          <w:sz w:val="21"/>
+          <w:szCs w:val="21"/>
         </w:rPr>
         <w:t>Financing</w:t>
       </w:r>
@@ -697,20 +675,16 @@
       <w:pPr>
         <w:pStyle w:val="Normal"/>
         <w:rPr>
-          <w:rFonts w:ascii="Tahoma" w:hAnsi="Tahoma" w:cs="Tahoma"/>
-          <w:b/>
-          <w:b/>
-          <w:sz w:val="20"/>
-          <w:szCs w:val="20"/>
-          <w:lang w:val="en-US"/>
+          <w:sz w:val="21"/>
+          <w:szCs w:val="21"/>
         </w:rPr>
       </w:pPr>
       <w:r>
         <w:rPr>
           <w:rFonts w:cs="Tahoma" w:ascii="Tahoma" w:hAnsi="Tahoma"/>
           <w:b/>
-          <w:sz w:val="20"/>
-          <w:szCs w:val="20"/>
+          <w:sz w:val="21"/>
+          <w:szCs w:val="21"/>
           <w:lang w:val="en-US"/>
         </w:rPr>
         <w:t xml:space="preserve">      </w:t>
@@ -720,17 +694,15 @@
       <w:pPr>
         <w:pStyle w:val="Normal"/>
         <w:rPr>
-          <w:rFonts w:ascii="Tahoma" w:hAnsi="Tahoma" w:cs="Tahoma"/>
-          <w:b/>
-          <w:b/>
-          <w:lang w:val="en-US"/>
+          <w:sz w:val="21"/>
+          <w:szCs w:val="21"/>
         </w:rPr>
       </w:pPr>
       <w:r>
         <w:rPr>
           <w:rFonts w:cs="Tahoma" w:ascii="Tahoma" w:hAnsi="Tahoma"/>
-          <w:sz w:val="20"/>
-          <w:szCs w:val="20"/>
+          <w:sz w:val="21"/>
+          <w:szCs w:val="21"/>
           <w:lang w:val="en-US"/>
         </w:rPr>
         <w:t>Moyen de transport</w:t>
@@ -739,8 +711,8 @@
         <w:rPr>
           <w:rFonts w:cs="Tahoma" w:ascii="Tahoma" w:hAnsi="Tahoma"/>
           <w:b/>
-          <w:sz w:val="20"/>
-          <w:szCs w:val="20"/>
+          <w:sz w:val="21"/>
+          <w:szCs w:val="21"/>
           <w:lang w:val="en-US"/>
         </w:rPr>
         <w:t xml:space="preserve">: </w:t>
@@ -748,6 +720,8 @@
       <w:r>
         <w:rPr>
           <w:rFonts w:cs="Tahoma" w:ascii="Tahoma" w:hAnsi="Tahoma"/>
+          <w:sz w:val="21"/>
+          <w:szCs w:val="21"/>
           <w:lang w:val="en-US"/>
         </w:rPr>
         <w:t>{moyenTransport}</w:t>
@@ -757,18 +731,15 @@
       <w:pPr>
         <w:pStyle w:val="Normal"/>
         <w:rPr>
-          <w:i/>
-          <w:i/>
-          <w:sz w:val="18"/>
-          <w:szCs w:val="18"/>
-          <w:lang w:val="en-US"/>
+          <w:sz w:val="21"/>
+          <w:szCs w:val="21"/>
         </w:rPr>
       </w:pPr>
       <w:r>
         <w:rPr>
           <w:i/>
-          <w:sz w:val="18"/>
-          <w:szCs w:val="18"/>
+          <w:sz w:val="21"/>
+          <w:szCs w:val="21"/>
           <w:lang w:val="en-US"/>
         </w:rPr>
         <w:t>Means of transport</w:t>
@@ -780,16 +751,16 @@
         <w:rPr>
           <w:i/>
           <w:i/>
-          <w:sz w:val="18"/>
-          <w:szCs w:val="18"/>
+          <w:sz w:val="21"/>
+          <w:szCs w:val="21"/>
           <w:lang w:val="en-US"/>
         </w:rPr>
       </w:pPr>
       <w:r>
         <w:rPr>
           <w:i/>
-          <w:sz w:val="18"/>
-          <w:szCs w:val="18"/>
+          <w:sz w:val="21"/>
+          <w:szCs w:val="21"/>
           <w:lang w:val="en-US"/>
         </w:rPr>
       </w:r>
@@ -798,14 +769,14 @@
       <w:pPr>
         <w:pStyle w:val="Normal"/>
         <w:rPr>
-          <w:sz w:val="20"/>
-          <w:szCs w:val="20"/>
+          <w:sz w:val="21"/>
+          <w:szCs w:val="21"/>
         </w:rPr>
       </w:pPr>
       <w:r>
         <w:rPr>
-          <w:sz w:val="20"/>
-          <w:szCs w:val="20"/>
+          <w:sz w:val="21"/>
+          <w:szCs w:val="21"/>
         </w:rPr>
         <w:t>Date de départ : {dateDepart} Date de retour : {dateRetour}</w:t>
       </w:r>
@@ -814,18 +785,15 @@
       <w:pPr>
         <w:pStyle w:val="Normal"/>
         <w:rPr>
-          <w:i/>
-          <w:i/>
-          <w:sz w:val="18"/>
-          <w:szCs w:val="18"/>
-          <w:lang w:val="en-GB"/>
+          <w:sz w:val="21"/>
+          <w:szCs w:val="21"/>
         </w:rPr>
       </w:pPr>
       <w:r>
         <w:rPr>
           <w:i/>
-          <w:sz w:val="18"/>
-          <w:szCs w:val="18"/>
+          <w:sz w:val="21"/>
+          <w:szCs w:val="21"/>
           <w:lang w:val="en-GB"/>
         </w:rPr>
         <w:t>Date of departure                                                          Date of return              date – heure – hour</w:t>
@@ -837,16 +805,16 @@
         <w:rPr>
           <w:b/>
           <w:b/>
-          <w:sz w:val="16"/>
-          <w:szCs w:val="16"/>
+          <w:sz w:val="21"/>
+          <w:szCs w:val="21"/>
           <w:lang w:val="en-GB"/>
         </w:rPr>
       </w:pPr>
       <w:r>
         <w:rPr>
           <w:b/>
-          <w:sz w:val="16"/>
-          <w:szCs w:val="16"/>
+          <w:sz w:val="21"/>
+          <w:szCs w:val="21"/>
           <w:lang w:val="en-GB"/>
         </w:rPr>
       </w:r>
@@ -855,17 +823,15 @@
       <w:pPr>
         <w:pStyle w:val="Normal"/>
         <w:rPr>
-          <w:i/>
-          <w:i/>
-          <w:sz w:val="16"/>
-          <w:szCs w:val="16"/>
+          <w:sz w:val="21"/>
+          <w:szCs w:val="21"/>
         </w:rPr>
       </w:pPr>
       <w:r>
         <mc:AlternateContent>
           <mc:Choice Requires="wps">
             <w:drawing>
-              <wp:anchor behindDoc="0" distT="5080" distB="13970" distL="8255" distR="10795" simplePos="0" locked="0" layoutInCell="0" allowOverlap="1" relativeHeight="5" wp14:anchorId="41AD60E9">
+              <wp:anchor behindDoc="0" distT="5080" distB="5080" distL="5080" distR="5080" simplePos="0" locked="0" layoutInCell="0" allowOverlap="1" relativeHeight="4" wp14:anchorId="41AD60E9">
                 <wp:simplePos x="0" y="0"/>
                 <wp:positionH relativeFrom="column">
                   <wp:posOffset>-2237105</wp:posOffset>
@@ -922,7 +888,7 @@
         <mc:AlternateContent>
           <mc:Choice Requires="wps">
             <w:drawing>
-              <wp:anchor behindDoc="0" distT="5080" distB="13970" distL="8255" distR="10795" simplePos="0" locked="0" layoutInCell="0" allowOverlap="1" relativeHeight="6" wp14:anchorId="405E7D69">
+              <wp:anchor behindDoc="0" distT="5080" distB="5080" distL="5080" distR="5080" simplePos="0" locked="0" layoutInCell="0" allowOverlap="1" relativeHeight="5" wp14:anchorId="405E7D69">
                 <wp:simplePos x="0" y="0"/>
                 <wp:positionH relativeFrom="column">
                   <wp:posOffset>-2237105</wp:posOffset>
@@ -979,7 +945,7 @@
         <mc:AlternateContent>
           <mc:Choice Requires="wps">
             <w:drawing>
-              <wp:anchor behindDoc="0" distT="5080" distB="13970" distL="8255" distR="10795" simplePos="0" locked="0" layoutInCell="0" allowOverlap="1" relativeHeight="7" wp14:anchorId="7076946A">
+              <wp:anchor behindDoc="0" distT="5080" distB="5080" distL="5080" distR="5080" simplePos="0" locked="0" layoutInCell="0" allowOverlap="1" relativeHeight="6" wp14:anchorId="7076946A">
                 <wp:simplePos x="0" y="0"/>
                 <wp:positionH relativeFrom="column">
                   <wp:posOffset>-1322705</wp:posOffset>
@@ -1036,7 +1002,7 @@
         <mc:AlternateContent>
           <mc:Choice Requires="wps">
             <w:drawing>
-              <wp:anchor behindDoc="0" distT="5080" distB="13970" distL="8255" distR="10795" simplePos="0" locked="0" layoutInCell="0" allowOverlap="1" relativeHeight="8" wp14:anchorId="41EE4D9A">
+              <wp:anchor behindDoc="0" distT="5080" distB="5080" distL="5080" distR="5080" simplePos="0" locked="0" layoutInCell="0" allowOverlap="1" relativeHeight="7" wp14:anchorId="41EE4D9A">
                 <wp:simplePos x="0" y="0"/>
                 <wp:positionH relativeFrom="column">
                   <wp:posOffset>-1094105</wp:posOffset>
@@ -1094,23 +1060,23 @@
       <w:r>
         <w:rPr>
           <w:b/>
-          <w:sz w:val="16"/>
-          <w:szCs w:val="16"/>
+          <w:sz w:val="21"/>
+          <w:szCs w:val="21"/>
         </w:rPr>
         <w:t>DELIVRE PAR NOUS</w:t>
       </w:r>
       <w:r>
         <w:rPr>
-          <w:sz w:val="16"/>
-          <w:szCs w:val="16"/>
+          <w:sz w:val="21"/>
+          <w:szCs w:val="21"/>
         </w:rPr>
         <w:t xml:space="preserve"> {nomEmetteur} – {gradeEmetteur}</w:t>
       </w:r>
       <w:r>
         <w:rPr>
           <w:i/>
-          <w:sz w:val="16"/>
-          <w:szCs w:val="16"/>
+          <w:sz w:val="21"/>
+          <w:szCs w:val="21"/>
         </w:rPr>
         <w:t xml:space="preserve"> </w:t>
       </w:r>
@@ -1119,27 +1085,25 @@
       <w:pPr>
         <w:pStyle w:val="Normal"/>
         <w:rPr>
-          <w:i/>
-          <w:i/>
-          <w:sz w:val="16"/>
-          <w:szCs w:val="16"/>
+          <w:sz w:val="21"/>
+          <w:szCs w:val="21"/>
         </w:rPr>
       </w:pPr>
       <w:r>
         <w:rPr>
           <w:i/>
-          <w:sz w:val="16"/>
-          <w:szCs w:val="16"/>
-        </w:rPr>
-        <w:t xml:space="preserve">                                                  </w:t>
+          <w:sz w:val="21"/>
+          <w:szCs w:val="21"/>
+        </w:rPr>
+        <w:t xml:space="preserve">                                         </w:t>
       </w:r>
       <w:r>
         <w:rPr>
           <w:i/>
-          <w:sz w:val="16"/>
-          <w:szCs w:val="16"/>
-        </w:rPr>
-        <w:t>nom – name                                   grade – rank</w:t>
+          <w:sz w:val="21"/>
+          <w:szCs w:val="21"/>
+        </w:rPr>
+        <w:t>nom – name           grade – rank</w:t>
       </w:r>
     </w:p>
     <w:p>
@@ -1148,20 +1112,20 @@
         <w:rPr>
           <w:i/>
           <w:i/>
-          <w:sz w:val="16"/>
-          <w:szCs w:val="16"/>
+          <w:sz w:val="21"/>
+          <w:szCs w:val="21"/>
         </w:rPr>
       </w:pPr>
       <w:r>
         <w:rPr>
           <w:i/>
-          <w:sz w:val="16"/>
-          <w:szCs w:val="16"/>
+          <w:sz w:val="21"/>
+          <w:szCs w:val="21"/>
         </w:rPr>
         <mc:AlternateContent>
           <mc:Choice Requires="wpg">
             <w:drawing>
-              <wp:anchor behindDoc="0" distT="8890" distB="10160" distL="8890" distR="6985" simplePos="0" locked="0" layoutInCell="0" allowOverlap="1" relativeHeight="9" wp14:anchorId="09755B1B">
+              <wp:anchor behindDoc="0" distT="5080" distB="5080" distL="5080" distR="5080" simplePos="0" locked="0" layoutInCell="0" allowOverlap="1" relativeHeight="8" wp14:anchorId="09755B1B">
                 <wp:simplePos x="0" y="0"/>
                 <wp:positionH relativeFrom="column">
                   <wp:posOffset>4440555</wp:posOffset>
@@ -1169,7 +1133,7 @@
                 <wp:positionV relativeFrom="paragraph">
                   <wp:posOffset>45720</wp:posOffset>
                 </wp:positionV>
-                <wp:extent cx="955675" cy="523875"/>
+                <wp:extent cx="956310" cy="523875"/>
                 <wp:effectExtent l="5080" t="5080" r="5080" b="5080"/>
                 <wp:wrapNone/>
                 <wp:docPr id="5" name="Group 12"/>
@@ -1180,9 +1144,9 @@
                       <wpg:grpSpPr>
                         <a:xfrm>
                           <a:off x="0" y="0"/>
-                          <a:ext cx="955800" cy="523800"/>
+                          <a:ext cx="956160" cy="523800"/>
                           <a:chOff x="0" y="0"/>
-                          <a:chExt cx="955800" cy="523800"/>
+                          <a:chExt cx="956160" cy="523800"/>
                         </a:xfrm>
                       </wpg:grpSpPr>
                       <wps:wsp>
@@ -1265,7 +1229,7 @@
                         <wps:spPr>
                           <a:xfrm>
                             <a:off x="955800" y="0"/>
-                            <a:ext cx="0" cy="76680"/>
+                            <a:ext cx="720" cy="76680"/>
                           </a:xfrm>
                           <a:prstGeom prst="line">
                             <a:avLst/>
@@ -1365,7 +1329,7 @@
                         <wps:spPr>
                           <a:xfrm flipV="1">
                             <a:off x="955800" y="447120"/>
-                            <a:ext cx="0" cy="76680"/>
+                            <a:ext cx="720" cy="76680"/>
                           </a:xfrm>
                           <a:prstGeom prst="line">
                             <a:avLst/>
@@ -1393,43 +1357,43 @@
           </mc:Choice>
           <mc:Fallback>
             <w:pict>
-              <v:group id="shape_0" alt="Group 12" style="position:absolute;margin-left:349.65pt;margin-top:3.6pt;width:75.2pt;height:41.2pt" coordorigin="6993,72" coordsize="1504,824">
-                <v:line id="shape_0" from="6993,72" to="6993,192" ID="Line 13" stroked="t" o:allowincell="f" style="position:absolute">
+              <v:group id="shape_0" alt="Group 12" style="position:absolute;margin-left:349.65pt;margin-top:3.6pt;width:75.25pt;height:41.2pt" coordorigin="6993,72" coordsize="1505,824">
+                <v:line id="shape_0" from="6993,72" to="6993,192" stroked="t" o:allowincell="f" style="position:absolute">
                   <v:stroke color="black" weight="9360" joinstyle="round" endcap="flat"/>
                   <v:fill o:detectmouseclick="t" on="false"/>
                   <w10:wrap type="none"/>
                 </v:line>
-                <v:line id="shape_0" from="6993,72" to="7293,72" ID="Line 14" stroked="t" o:allowincell="f" style="position:absolute">
+                <v:line id="shape_0" from="6993,72" to="7293,72" stroked="t" o:allowincell="f" style="position:absolute">
                   <v:stroke color="black" weight="9360" joinstyle="round" endcap="flat"/>
                   <v:fill o:detectmouseclick="t" on="false"/>
                   <w10:wrap type="none"/>
                 </v:line>
-                <v:line id="shape_0" from="8197,72" to="8497,72" ID="Line 15" stroked="t" o:allowincell="f" style="position:absolute">
+                <v:line id="shape_0" from="8197,72" to="8497,72" stroked="t" o:allowincell="f" style="position:absolute">
                   <v:stroke color="black" weight="9360" joinstyle="round" endcap="flat"/>
                   <v:fill o:detectmouseclick="t" on="false"/>
                   <w10:wrap type="none"/>
                 </v:line>
-                <v:line id="shape_0" from="8498,72" to="8498,192" ID="Line 16" stroked="t" o:allowincell="f" style="position:absolute">
+                <v:line id="shape_0" from="8498,72" to="8498,192" stroked="t" o:allowincell="f" style="position:absolute">
                   <v:stroke color="black" weight="9360" joinstyle="round" endcap="flat"/>
                   <v:fill o:detectmouseclick="t" on="false"/>
                   <w10:wrap type="none"/>
                 </v:line>
-                <v:line id="shape_0" from="6993,776" to="6993,896" ID="Line 17" stroked="t" o:allowincell="f" style="position:absolute">
+                <v:line id="shape_0" from="6993,776" to="6993,896" stroked="t" o:allowincell="f" style="position:absolute">
                   <v:stroke color="black" weight="9360" joinstyle="round" endcap="flat"/>
                   <v:fill o:detectmouseclick="t" on="false"/>
                   <w10:wrap type="none"/>
                 </v:line>
-                <v:line id="shape_0" from="6993,897" to="7239,897" ID="Line 18" stroked="t" o:allowincell="f" style="position:absolute">
+                <v:line id="shape_0" from="6993,897" to="7239,897" stroked="t" o:allowincell="f" style="position:absolute">
                   <v:stroke color="black" weight="9360" joinstyle="round" endcap="flat"/>
                   <v:fill o:detectmouseclick="t" on="false"/>
                   <w10:wrap type="none"/>
                 </v:line>
-                <v:line id="shape_0" from="8197,897" to="8497,897" ID="Line 19" stroked="t" o:allowincell="f" style="position:absolute">
+                <v:line id="shape_0" from="8197,897" to="8497,897" stroked="t" o:allowincell="f" style="position:absolute">
                   <v:stroke color="black" weight="9360" joinstyle="round" endcap="flat"/>
                   <v:fill o:detectmouseclick="t" on="false"/>
                   <w10:wrap type="none"/>
                 </v:line>
-                <v:line id="shape_0" from="8498,776" to="8498,896" ID="Line 20" stroked="t" o:allowincell="f" style="position:absolute;flip:y">
+                <v:line id="shape_0" from="8498,776" to="8498,896" stroked="t" o:allowincell="f" style="position:absolute;flip:y">
                   <v:stroke color="black" weight="9360" joinstyle="round" endcap="flat"/>
                   <v:fill o:detectmouseclick="t" on="false"/>
                   <w10:wrap type="none"/>
@@ -1444,15 +1408,14 @@
       <w:pPr>
         <w:pStyle w:val="Normal"/>
         <w:rPr>
-          <w:sz w:val="16"/>
-          <w:szCs w:val="16"/>
-          <w:lang w:val="en-GB"/>
+          <w:sz w:val="21"/>
+          <w:szCs w:val="21"/>
         </w:rPr>
       </w:pPr>
       <w:r>
         <w:rPr>
-          <w:sz w:val="16"/>
-          <w:szCs w:val="16"/>
+          <w:sz w:val="21"/>
+          <w:szCs w:val="21"/>
           <w:lang w:val="en-GB"/>
         </w:rPr>
         <w:t>Fonction– function {fonctionEmetteur}</w:t>
@@ -1462,15 +1425,15 @@
       <w:pPr>
         <w:pStyle w:val="Normal"/>
         <w:rPr>
-          <w:sz w:val="16"/>
-          <w:szCs w:val="16"/>
+          <w:sz w:val="21"/>
+          <w:szCs w:val="21"/>
           <w:lang w:val="en-GB"/>
         </w:rPr>
       </w:pPr>
       <w:r>
         <w:rPr>
-          <w:sz w:val="16"/>
-          <w:szCs w:val="16"/>
+          <w:sz w:val="21"/>
+          <w:szCs w:val="21"/>
           <w:lang w:val="en-GB"/>
         </w:rPr>
       </w:r>
@@ -1479,24 +1442,23 @@
       <w:pPr>
         <w:pStyle w:val="Normal"/>
         <w:rPr>
-          <w:sz w:val="16"/>
-          <w:szCs w:val="16"/>
-          <w:lang w:val="en-GB"/>
+          <w:sz w:val="21"/>
+          <w:szCs w:val="21"/>
         </w:rPr>
       </w:pPr>
       <w:r>
         <w:rPr>
           <w:b/>
-          <w:sz w:val="16"/>
-          <w:szCs w:val="16"/>
+          <w:sz w:val="21"/>
+          <w:szCs w:val="21"/>
           <w:lang w:val="en-GB"/>
         </w:rPr>
         <w:t xml:space="preserve">A </w:t>
       </w:r>
       <w:r>
         <w:rPr>
-          <w:sz w:val="16"/>
-          <w:szCs w:val="16"/>
+          <w:sz w:val="21"/>
+          <w:szCs w:val="21"/>
           <w:lang w:val="en-GB"/>
         </w:rPr>
         <w:t xml:space="preserve">(At) {lieuEmission}, </w:t>
@@ -1504,16 +1466,16 @@
       <w:r>
         <w:rPr>
           <w:b/>
-          <w:sz w:val="16"/>
-          <w:szCs w:val="16"/>
+          <w:sz w:val="21"/>
+          <w:szCs w:val="21"/>
           <w:lang w:val="en-GB"/>
         </w:rPr>
         <w:t xml:space="preserve">le </w:t>
       </w:r>
       <w:r>
         <w:rPr>
-          <w:sz w:val="16"/>
-          <w:szCs w:val="16"/>
+          <w:sz w:val="21"/>
+          <w:szCs w:val="21"/>
           <w:lang w:val="en-GB"/>
         </w:rPr>
         <w:t>(on the) {dateEmission}</w:t>
@@ -1890,10 +1852,10 @@
       </w:tblPr>
       <w:tblGrid>
         <w:gridCol w:w="2160"/>
-        <w:gridCol w:w="899"/>
-        <w:gridCol w:w="181"/>
-        <w:gridCol w:w="1067"/>
-        <w:gridCol w:w="249"/>
+        <w:gridCol w:w="897"/>
+        <w:gridCol w:w="183"/>
+        <w:gridCol w:w="1066"/>
+        <w:gridCol w:w="250"/>
         <w:gridCol w:w="550"/>
         <w:gridCol w:w="1194"/>
         <w:gridCol w:w="1620"/>
@@ -2037,7 +1999,7 @@
               <mc:AlternateContent>
                 <mc:Choice Requires="wps">
                   <w:drawing>
-                    <wp:anchor behindDoc="0" distT="8255" distB="10795" distL="5080" distR="13970" simplePos="0" locked="0" layoutInCell="0" allowOverlap="1" relativeHeight="11" wp14:anchorId="069034F2">
+                    <wp:anchor behindDoc="0" distT="5080" distB="5080" distL="5080" distR="5080" simplePos="0" locked="0" layoutInCell="0" allowOverlap="1" relativeHeight="11" wp14:anchorId="069034F2">
                       <wp:simplePos x="0" y="0"/>
                       <wp:positionH relativeFrom="column">
                         <wp:posOffset>-68580</wp:posOffset>
@@ -2336,7 +2298,7 @@
               <mc:AlternateContent>
                 <mc:Choice Requires="wps">
                   <w:drawing>
-                    <wp:anchor behindDoc="0" distT="10160" distB="8890" distL="13335" distR="5715" simplePos="0" locked="0" layoutInCell="0" allowOverlap="1" relativeHeight="12" wp14:anchorId="107E595D">
+                    <wp:anchor behindDoc="0" distT="5080" distB="5080" distL="5080" distR="5080" simplePos="0" locked="0" layoutInCell="0" allowOverlap="1" relativeHeight="12" wp14:anchorId="107E595D">
                       <wp:simplePos x="0" y="0"/>
                       <wp:positionH relativeFrom="column">
                         <wp:posOffset>1111250</wp:posOffset>
@@ -2393,7 +2355,7 @@
               <mc:AlternateContent>
                 <mc:Choice Requires="wps">
                   <w:drawing>
-                    <wp:anchor behindDoc="0" distT="10160" distB="8890" distL="13335" distR="5715" simplePos="0" locked="0" layoutInCell="0" allowOverlap="1" relativeHeight="13" wp14:anchorId="2B3E6B80">
+                    <wp:anchor behindDoc="0" distT="5080" distB="5080" distL="5080" distR="5080" simplePos="0" locked="0" layoutInCell="0" allowOverlap="1" relativeHeight="13" wp14:anchorId="2B3E6B80">
                       <wp:simplePos x="0" y="0"/>
                       <wp:positionH relativeFrom="column">
                         <wp:posOffset>1111250</wp:posOffset>
@@ -2450,7 +2412,7 @@
               <mc:AlternateContent>
                 <mc:Choice Requires="wps">
                   <w:drawing>
-                    <wp:anchor behindDoc="0" distT="10160" distB="8890" distL="13335" distR="5715" simplePos="0" locked="0" layoutInCell="0" allowOverlap="1" relativeHeight="14" wp14:anchorId="740729D7">
+                    <wp:anchor behindDoc="0" distT="5080" distB="5080" distL="5080" distR="5080" simplePos="0" locked="0" layoutInCell="0" allowOverlap="1" relativeHeight="14" wp14:anchorId="740729D7">
                       <wp:simplePos x="0" y="0"/>
                       <wp:positionH relativeFrom="column">
                         <wp:posOffset>1225550</wp:posOffset>
@@ -2507,7 +2469,7 @@
               <mc:AlternateContent>
                 <mc:Choice Requires="wps">
                   <w:drawing>
-                    <wp:anchor behindDoc="0" distT="10160" distB="8890" distL="13335" distR="5715" simplePos="0" locked="0" layoutInCell="0" allowOverlap="1" relativeHeight="15" wp14:anchorId="4DFAE30D">
+                    <wp:anchor behindDoc="0" distT="5080" distB="5080" distL="5080" distR="5080" simplePos="0" locked="0" layoutInCell="0" allowOverlap="1" relativeHeight="15" wp14:anchorId="4DFAE30D">
                       <wp:simplePos x="0" y="0"/>
                       <wp:positionH relativeFrom="column">
                         <wp:posOffset>2139950</wp:posOffset>
@@ -2564,7 +2526,7 @@
               <mc:AlternateContent>
                 <mc:Choice Requires="wps">
                   <w:drawing>
-                    <wp:anchor behindDoc="0" distT="10160" distB="8890" distL="13335" distR="5715" simplePos="0" locked="0" layoutInCell="0" allowOverlap="1" relativeHeight="16" wp14:anchorId="3AF6A637">
+                    <wp:anchor behindDoc="0" distT="5080" distB="5080" distL="5080" distR="5080" simplePos="0" locked="0" layoutInCell="0" allowOverlap="1" relativeHeight="16" wp14:anchorId="3AF6A637">
                       <wp:simplePos x="0" y="0"/>
                       <wp:positionH relativeFrom="column">
                         <wp:posOffset>2254250</wp:posOffset>
@@ -2621,7 +2583,7 @@
               <mc:AlternateContent>
                 <mc:Choice Requires="wps">
                   <w:drawing>
-                    <wp:anchor behindDoc="0" distT="10160" distB="8890" distL="13335" distR="5715" simplePos="0" locked="0" layoutInCell="0" allowOverlap="1" relativeHeight="17" wp14:anchorId="2C098789">
+                    <wp:anchor behindDoc="0" distT="5080" distB="5080" distL="5080" distR="5080" simplePos="0" locked="0" layoutInCell="0" allowOverlap="1" relativeHeight="17" wp14:anchorId="2C098789">
                       <wp:simplePos x="0" y="0"/>
                       <wp:positionH relativeFrom="column">
                         <wp:posOffset>2139950</wp:posOffset>
@@ -2746,7 +2708,7 @@
                 <w:lang w:val="en-GB"/>
               </w:rPr>
               <w:drawing>
-                <wp:anchor behindDoc="1" distT="0" distB="0" distL="0" distR="0" simplePos="0" locked="0" layoutInCell="1" allowOverlap="1" relativeHeight="4">
+                <wp:anchor behindDoc="1" distT="0" distB="0" distL="0" distR="0" simplePos="0" locked="0" layoutInCell="1" allowOverlap="1" relativeHeight="10">
                   <wp:simplePos x="0" y="0"/>
                   <wp:positionH relativeFrom="column">
                     <wp:posOffset>404495</wp:posOffset>
@@ -3746,7 +3708,7 @@
         <w:trPr/>
         <w:tc>
           <w:tcPr>
-            <w:tcW w:w="3059" w:type="dxa"/>
+            <w:tcW w:w="3057" w:type="dxa"/>
             <w:gridSpan w:val="2"/>
             <w:vMerge w:val="restart"/>
             <w:tcBorders>
@@ -4207,7 +4169,7 @@
         </w:tc>
         <w:tc>
           <w:tcPr>
-            <w:tcW w:w="1248" w:type="dxa"/>
+            <w:tcW w:w="1249" w:type="dxa"/>
             <w:gridSpan w:val="2"/>
             <w:tcBorders>
               <w:top w:val="single" w:sz="6" w:space="0" w:color="000000"/>
@@ -4280,7 +4242,7 @@
         </w:tc>
         <w:tc>
           <w:tcPr>
-            <w:tcW w:w="799" w:type="dxa"/>
+            <w:tcW w:w="800" w:type="dxa"/>
             <w:gridSpan w:val="2"/>
             <w:tcBorders>
               <w:top w:val="single" w:sz="6" w:space="0" w:color="000000"/>
@@ -4633,7 +4595,7 @@
         <w:trPr/>
         <w:tc>
           <w:tcPr>
-            <w:tcW w:w="3059" w:type="dxa"/>
+            <w:tcW w:w="3057" w:type="dxa"/>
             <w:gridSpan w:val="2"/>
             <w:vMerge w:val="continue"/>
             <w:tcBorders>
@@ -4660,7 +4622,7 @@
         </w:tc>
         <w:tc>
           <w:tcPr>
-            <w:tcW w:w="1248" w:type="dxa"/>
+            <w:tcW w:w="1249" w:type="dxa"/>
             <w:gridSpan w:val="2"/>
             <w:tcBorders>
               <w:top w:val="single" w:sz="6" w:space="0" w:color="000000"/>
@@ -4686,7 +4648,7 @@
         </w:tc>
         <w:tc>
           <w:tcPr>
-            <w:tcW w:w="799" w:type="dxa"/>
+            <w:tcW w:w="800" w:type="dxa"/>
             <w:gridSpan w:val="2"/>
             <w:tcBorders>
               <w:top w:val="single" w:sz="6" w:space="0" w:color="000000"/>
@@ -4767,7 +4729,7 @@
         <w:trPr/>
         <w:tc>
           <w:tcPr>
-            <w:tcW w:w="3059" w:type="dxa"/>
+            <w:tcW w:w="3057" w:type="dxa"/>
             <w:gridSpan w:val="2"/>
             <w:vMerge w:val="continue"/>
             <w:tcBorders>
@@ -4794,7 +4756,7 @@
         </w:tc>
         <w:tc>
           <w:tcPr>
-            <w:tcW w:w="1248" w:type="dxa"/>
+            <w:tcW w:w="1249" w:type="dxa"/>
             <w:gridSpan w:val="2"/>
             <w:tcBorders>
               <w:top w:val="single" w:sz="6" w:space="0" w:color="000000"/>
@@ -4820,7 +4782,7 @@
         </w:tc>
         <w:tc>
           <w:tcPr>
-            <w:tcW w:w="799" w:type="dxa"/>
+            <w:tcW w:w="800" w:type="dxa"/>
             <w:gridSpan w:val="2"/>
             <w:tcBorders>
               <w:top w:val="single" w:sz="6" w:space="0" w:color="000000"/>
@@ -4901,7 +4863,7 @@
         <w:trPr/>
         <w:tc>
           <w:tcPr>
-            <w:tcW w:w="3059" w:type="dxa"/>
+            <w:tcW w:w="3057" w:type="dxa"/>
             <w:gridSpan w:val="2"/>
             <w:vMerge w:val="continue"/>
             <w:tcBorders>
@@ -4928,7 +4890,7 @@
         </w:tc>
         <w:tc>
           <w:tcPr>
-            <w:tcW w:w="1248" w:type="dxa"/>
+            <w:tcW w:w="1249" w:type="dxa"/>
             <w:gridSpan w:val="2"/>
             <w:tcBorders>
               <w:top w:val="single" w:sz="6" w:space="0" w:color="000000"/>
@@ -4954,7 +4916,7 @@
         </w:tc>
         <w:tc>
           <w:tcPr>
-            <w:tcW w:w="799" w:type="dxa"/>
+            <w:tcW w:w="800" w:type="dxa"/>
             <w:gridSpan w:val="2"/>
             <w:tcBorders>
               <w:top w:val="single" w:sz="6" w:space="0" w:color="000000"/>
@@ -5035,7 +4997,7 @@
         <w:trPr/>
         <w:tc>
           <w:tcPr>
-            <w:tcW w:w="3059" w:type="dxa"/>
+            <w:tcW w:w="3057" w:type="dxa"/>
             <w:gridSpan w:val="2"/>
             <w:vMerge w:val="continue"/>
             <w:tcBorders>
@@ -5062,7 +5024,7 @@
         </w:tc>
         <w:tc>
           <w:tcPr>
-            <w:tcW w:w="1248" w:type="dxa"/>
+            <w:tcW w:w="1249" w:type="dxa"/>
             <w:gridSpan w:val="2"/>
             <w:tcBorders>
               <w:top w:val="single" w:sz="6" w:space="0" w:color="000000"/>
@@ -5088,7 +5050,7 @@
         </w:tc>
         <w:tc>
           <w:tcPr>
-            <w:tcW w:w="799" w:type="dxa"/>
+            <w:tcW w:w="800" w:type="dxa"/>
             <w:gridSpan w:val="2"/>
             <w:tcBorders>
               <w:top w:val="single" w:sz="6" w:space="0" w:color="000000"/>
@@ -5171,7 +5133,7 @@
         </w:trPr>
         <w:tc>
           <w:tcPr>
-            <w:tcW w:w="3059" w:type="dxa"/>
+            <w:tcW w:w="3057" w:type="dxa"/>
             <w:gridSpan w:val="2"/>
             <w:vMerge w:val="continue"/>
             <w:tcBorders>
@@ -5197,7 +5159,7 @@
         </w:tc>
         <w:tc>
           <w:tcPr>
-            <w:tcW w:w="7764" w:type="dxa"/>
+            <w:tcW w:w="7766" w:type="dxa"/>
             <w:gridSpan w:val="8"/>
             <w:tcBorders>
               <w:top w:val="single" w:sz="6" w:space="0" w:color="000000"/>
@@ -5225,7 +5187,7 @@
               <mc:AlternateContent>
                 <mc:Choice Requires="wps">
                   <w:drawing>
-                    <wp:anchor behindDoc="0" distT="13335" distB="5715" distL="5080" distR="13970" simplePos="0" locked="0" layoutInCell="0" allowOverlap="1" relativeHeight="18" wp14:anchorId="1DB9725F">
+                    <wp:anchor behindDoc="0" distT="5080" distB="5080" distL="5080" distR="5080" simplePos="0" locked="0" layoutInCell="0" allowOverlap="1" relativeHeight="18" wp14:anchorId="1DB9725F">
                       <wp:simplePos x="0" y="0"/>
                       <wp:positionH relativeFrom="column">
                         <wp:posOffset>1074420</wp:posOffset>
@@ -5285,7 +5247,7 @@
               <mc:AlternateContent>
                 <mc:Choice Requires="wps">
                   <w:drawing>
-                    <wp:anchor behindDoc="0" distT="13335" distB="5715" distL="5080" distR="13970" simplePos="0" locked="0" layoutInCell="0" allowOverlap="1" relativeHeight="22" wp14:anchorId="44170F9B">
+                    <wp:anchor behindDoc="0" distT="5080" distB="5080" distL="5080" distR="5080" simplePos="0" locked="0" layoutInCell="0" allowOverlap="1" relativeHeight="22" wp14:anchorId="44170F9B">
                       <wp:simplePos x="0" y="0"/>
                       <wp:positionH relativeFrom="column">
                         <wp:posOffset>-68580</wp:posOffset>
@@ -5440,7 +5402,7 @@
               <mc:AlternateContent>
                 <mc:Choice Requires="wps">
                   <w:drawing>
-                    <wp:anchor behindDoc="0" distT="7620" distB="11430" distL="6350" distR="12700" simplePos="0" locked="0" layoutInCell="0" allowOverlap="1" relativeHeight="19" wp14:anchorId="7D03691D">
+                    <wp:anchor behindDoc="0" distT="5080" distB="5080" distL="5080" distR="5080" simplePos="0" locked="0" layoutInCell="0" allowOverlap="1" relativeHeight="19" wp14:anchorId="7D03691D">
                       <wp:simplePos x="0" y="0"/>
                       <wp:positionH relativeFrom="column">
                         <wp:posOffset>1066165</wp:posOffset>
@@ -5592,7 +5554,7 @@
               <mc:AlternateContent>
                 <mc:Choice Requires="wps">
                   <w:drawing>
-                    <wp:anchor behindDoc="0" distT="10160" distB="8890" distL="12700" distR="11430" simplePos="0" locked="0" layoutInCell="0" allowOverlap="1" relativeHeight="20" wp14:anchorId="076505A7">
+                    <wp:anchor behindDoc="0" distT="5080" distB="5080" distL="5080" distR="5080" simplePos="0" locked="0" layoutInCell="0" allowOverlap="1" relativeHeight="20" wp14:anchorId="076505A7">
                       <wp:simplePos x="0" y="0"/>
                       <wp:positionH relativeFrom="column">
                         <wp:posOffset>1986915</wp:posOffset>
@@ -5705,7 +5667,7 @@
               <mc:AlternateContent>
                 <mc:Choice Requires="wps">
                   <w:drawing>
-                    <wp:anchor behindDoc="0" distT="5080" distB="13970" distL="5080" distR="13970" simplePos="0" locked="0" layoutInCell="0" allowOverlap="1" relativeHeight="21" wp14:anchorId="2DCF8E5A">
+                    <wp:anchor behindDoc="0" distT="5080" distB="5080" distL="5080" distR="5080" simplePos="0" locked="0" layoutInCell="0" allowOverlap="1" relativeHeight="21" wp14:anchorId="2DCF8E5A">
                       <wp:simplePos x="0" y="0"/>
                       <wp:positionH relativeFrom="column">
                         <wp:posOffset>1074420</wp:posOffset>
@@ -5891,7 +5853,7 @@
       <w:pPr>
         <w:pStyle w:val="Normal"/>
         <w:shd w:val="clear" w:color="auto" w:fill="FFFFFF"/>
-        <w:spacing w:lineRule="auto" w:line="165"/>
+        <w:spacing w:lineRule="auto" w:line="163"/>
         <w:rPr/>
       </w:pPr>
       <w:r>
@@ -5954,7 +5916,7 @@
       <mc:AlternateContent>
         <mc:Choice Requires="wpg">
           <w:drawing>
-            <wp:anchor behindDoc="1" distT="6350" distB="3810" distL="12700" distR="7620" simplePos="0" locked="0" layoutInCell="0" allowOverlap="1" relativeHeight="3" wp14:anchorId="3102FE68">
+            <wp:anchor behindDoc="1" distT="3175" distB="156210" distL="2540" distR="1905" simplePos="0" locked="0" layoutInCell="0" allowOverlap="1" relativeHeight="3" wp14:anchorId="3102FE68">
               <wp:simplePos x="0" y="0"/>
               <wp:positionH relativeFrom="column">
                 <wp:posOffset>-413385</wp:posOffset>
@@ -5982,8 +5944,8 @@
                       <wps:cNvSpPr/>
                       <wps:spPr>
                         <a:xfrm>
-                          <a:off x="151200" y="2066760"/>
-                          <a:ext cx="3600360" cy="1161360"/>
+                          <a:off x="151200" y="2068200"/>
+                          <a:ext cx="3600360" cy="1160280"/>
                         </a:xfrm>
                         <a:prstGeom prst="rect">
                           <a:avLst/>
@@ -6059,12 +6021,12 @@
                             </w:pPr>
                             <w:r>
                               <w:rPr>
-                                <w:spacing w:val="0"/>
                                 <w:smallCaps w:val="false"/>
                                 <w:caps w:val="false"/>
                                 <w:iCs w:val="false"/>
                                 <w:bCs w:val="false"/>
                                 <w:szCs w:val="18"/>
+                                <w:spacing w:val="0"/>
                                 <w:vertAlign w:val="baseline"/>
                                 <w:position w:val="0"/>
                                 <w:sz w:val="18"/>
@@ -6090,12 +6052,12 @@
                             </w:pPr>
                             <w:r>
                               <w:rPr>
-                                <w:spacing w:val="0"/>
                                 <w:smallCaps w:val="false"/>
                                 <w:caps w:val="false"/>
                                 <w:iCs w:val="false"/>
                                 <w:bCs w:val="false"/>
                                 <w:szCs w:val="18"/>
+                                <w:spacing w:val="0"/>
                                 <w:vertAlign w:val="baseline"/>
                                 <w:position w:val="0"/>
                                 <w:sz w:val="18"/>
@@ -6121,12 +6083,12 @@
                             </w:pPr>
                             <w:r>
                               <w:rPr>
-                                <w:spacing w:val="0"/>
                                 <w:smallCaps w:val="false"/>
                                 <w:caps w:val="false"/>
                                 <w:iCs w:val="false"/>
                                 <w:bCs w:val="false"/>
                                 <w:szCs w:val="18"/>
+                                <w:spacing w:val="0"/>
                                 <w:vertAlign w:val="baseline"/>
                                 <w:position w:val="0"/>
                                 <w:sz w:val="18"/>
@@ -6222,13 +6184,13 @@
                                 <w:i w:val="false"/>
                                 <w:vertAlign w:val="baseline"/>
                                 <w:position w:val="0"/>
+                                <w:spacing w:val="0"/>
                                 <w:szCs w:val="18"/>
                                 <w:bCs w:val="false"/>
                                 <w:iCs w:val="false"/>
                                 <w:smallCaps w:val="false"/>
                                 <w:caps w:val="false"/>
-                                <w:spacing w:val="0"/>
-                                <w:rFonts w:eastAsia="Calibri" w:ascii="Eras Demi ITC" w:hAnsi="Eras Demi ITC"/>
+                                <w:rFonts w:ascii="Eras Demi ITC" w:hAnsi="Eras Demi ITC" w:eastAsia="Calibri"/>
                                 <w:color w:val="060060"/>
                                 <w:lang w:eastAsia="fr-CM" w:val="en-US"/>
                               </w:rPr>
@@ -6244,13 +6206,13 @@
                                 <w:i w:val="false"/>
                                 <w:vertAlign w:val="baseline"/>
                                 <w:position w:val="0"/>
+                                <w:spacing w:val="0"/>
                                 <w:szCs w:val="18"/>
                                 <w:bCs w:val="false"/>
                                 <w:iCs w:val="false"/>
                                 <w:smallCaps w:val="false"/>
                                 <w:caps w:val="false"/>
-                                <w:spacing w:val="0"/>
-                                <w:rFonts w:eastAsia="Calibri" w:ascii="Eras Demi ITC" w:hAnsi="Eras Demi ITC"/>
+                                <w:rFonts w:ascii="Eras Demi ITC" w:hAnsi="Eras Demi ITC" w:eastAsia="Calibri"/>
                                 <w:color w:val="060060"/>
                                 <w:lang w:eastAsia="fr-CM" w:val="fr-FR"/>
                               </w:rPr>
@@ -6275,7 +6237,7 @@
                           </w:p>
                         </w:txbxContent>
                       </wps:txbx>
-                      <wps:bodyPr tIns="80640" bIns="80640" anchor="t" upright="1">
+                      <wps:bodyPr lIns="90000" rIns="90000" tIns="501840" bIns="501840" anchor="t" upright="1">
                         <a:noAutofit/>
                       </wps:bodyPr>
                     </wps:wsp>
@@ -6283,7 +6245,7 @@
                       <wps:cNvSpPr/>
                       <wps:spPr>
                         <a:xfrm>
-                          <a:off x="0" y="2181240"/>
+                          <a:off x="0" y="2182320"/>
                           <a:ext cx="3989880" cy="720"/>
                         </a:xfrm>
                         <a:prstGeom prst="straightConnector1">
@@ -6340,7 +6302,7 @@
         <mc:Fallback>
           <w:pict>
             <v:group id="shape_0" alt="Group 17" style="position:absolute;margin-left:-32.55pt;margin-top:-210.3pt;width:314.15pt;height:254.25pt" coordorigin="-651,-4206" coordsize="6283,5085">
-              <v:rect id="shape_0" ID="Rectangle 14" path="m0,0l-2147483645,0l-2147483645,-2147483646l0,-2147483646xe" fillcolor="white" stroked="f" o:allowincell="f" style="position:absolute;left:-413;top:-950;width:5669;height:1828;mso-wrap-style:square;v-text-anchor:top">
+              <v:rect id="shape_0" path="m0,0l-2147483645,0l-2147483645,-2147483646l0,-2147483646xe" fillcolor="white" stroked="f" o:allowincell="f" style="position:absolute;left:-413;top:-948;width:5669;height:1826;mso-wrap-style:square;v-text-anchor:top">
                 <v:textbox>
                   <w:txbxContent>
                     <w:p>
@@ -6399,12 +6361,12 @@
                       </w:pPr>
                       <w:r>
                         <w:rPr>
-                          <w:spacing w:val="0"/>
                           <w:smallCaps w:val="false"/>
                           <w:caps w:val="false"/>
                           <w:iCs w:val="false"/>
                           <w:bCs w:val="false"/>
                           <w:szCs w:val="18"/>
+                          <w:spacing w:val="0"/>
                           <w:vertAlign w:val="baseline"/>
                           <w:position w:val="0"/>
                           <w:sz w:val="18"/>
@@ -6430,12 +6392,12 @@
                       </w:pPr>
                       <w:r>
                         <w:rPr>
-                          <w:spacing w:val="0"/>
                           <w:smallCaps w:val="false"/>
                           <w:caps w:val="false"/>
                           <w:iCs w:val="false"/>
                           <w:bCs w:val="false"/>
                           <w:szCs w:val="18"/>
+                          <w:spacing w:val="0"/>
                           <w:vertAlign w:val="baseline"/>
                           <w:position w:val="0"/>
                           <w:sz w:val="18"/>
@@ -6461,12 +6423,12 @@
                       </w:pPr>
                       <w:r>
                         <w:rPr>
-                          <w:spacing w:val="0"/>
                           <w:smallCaps w:val="false"/>
                           <w:caps w:val="false"/>
                           <w:iCs w:val="false"/>
                           <w:bCs w:val="false"/>
                           <w:szCs w:val="18"/>
+                          <w:spacing w:val="0"/>
                           <w:vertAlign w:val="baseline"/>
                           <w:position w:val="0"/>
                           <w:sz w:val="18"/>
@@ -6562,13 +6524,13 @@
                           <w:i w:val="false"/>
                           <w:vertAlign w:val="baseline"/>
                           <w:position w:val="0"/>
+                          <w:spacing w:val="0"/>
                           <w:szCs w:val="18"/>
                           <w:bCs w:val="false"/>
                           <w:iCs w:val="false"/>
                           <w:smallCaps w:val="false"/>
                           <w:caps w:val="false"/>
-                          <w:spacing w:val="0"/>
-                          <w:rFonts w:eastAsia="Calibri" w:ascii="Eras Demi ITC" w:hAnsi="Eras Demi ITC"/>
+                          <w:rFonts w:ascii="Eras Demi ITC" w:hAnsi="Eras Demi ITC" w:eastAsia="Calibri"/>
                           <w:color w:val="060060"/>
                           <w:lang w:eastAsia="fr-CM" w:val="en-US"/>
                         </w:rPr>
@@ -6584,13 +6546,13 @@
                           <w:i w:val="false"/>
                           <w:vertAlign w:val="baseline"/>
                           <w:position w:val="0"/>
+                          <w:spacing w:val="0"/>
                           <w:szCs w:val="18"/>
                           <w:bCs w:val="false"/>
                           <w:iCs w:val="false"/>
                           <w:smallCaps w:val="false"/>
                           <w:caps w:val="false"/>
-                          <w:spacing w:val="0"/>
-                          <w:rFonts w:eastAsia="Calibri" w:ascii="Eras Demi ITC" w:hAnsi="Eras Demi ITC"/>
+                          <w:rFonts w:ascii="Eras Demi ITC" w:hAnsi="Eras Demi ITC" w:eastAsia="Calibri"/>
                           <w:color w:val="060060"/>
                           <w:lang w:eastAsia="fr-CM" w:val="fr-FR"/>
                         </w:rPr>
@@ -6619,12 +6581,12 @@
                 <v:stroke color="#3465a4" joinstyle="round" endcap="flat"/>
                 <w10:wrap type="none"/>
               </v:rect>
-              <v:shape id="shape_0" ID="AutoShape 15" stroked="t" o:allowincell="f" style="position:absolute;left:-651;top:-770;width:6282;height:0;mso-wrap-style:none;v-text-anchor:middle" type="_x0000_t32">
+              <v:shape id="shape_0" stroked="t" o:allowincell="f" style="position:absolute;left:-651;top:-768;width:6282;height:0;mso-wrap-style:none;v-text-anchor:middle" type="_x0000_t32">
                 <v:fill o:detectmouseclick="t" on="false"/>
                 <v:stroke color="#ed9100" weight="3240" joinstyle="round" endcap="flat"/>
                 <w10:wrap type="none"/>
               </v:shape>
-              <v:shape id="shape_0" ID="AutoShape 16" stroked="t" o:allowincell="f" style="position:absolute;left:-351;top:-4205;width:0;height:4918;flip:y;mso-wrap-style:none;v-text-anchor:middle" type="_x0000_t32">
+              <v:shape id="shape_0" stroked="t" o:allowincell="f" style="position:absolute;left:-351;top:-4205;width:0;height:4918;flip:y;mso-wrap-style:none;v-text-anchor:middle" type="_x0000_t32">
                 <v:fill o:detectmouseclick="t" on="false"/>
                 <v:stroke color="#ed9100" weight="3240" joinstyle="round" endcap="flat"/>
                 <w10:wrap type="none"/>
@@ -6650,7 +6612,7 @@
       <mc:AlternateContent>
         <mc:Choice Requires="wpg">
           <w:drawing>
-            <wp:anchor behindDoc="1" distT="0" distB="0" distL="0" distR="12065" simplePos="0" locked="0" layoutInCell="0" allowOverlap="1" relativeHeight="2" wp14:anchorId="340A125F">
+            <wp:anchor behindDoc="1" distT="0" distB="50165" distL="0" distR="1905" simplePos="0" locked="0" layoutInCell="0" allowOverlap="1" relativeHeight="2" wp14:anchorId="340A125F">
               <wp:simplePos x="0" y="0"/>
               <wp:positionH relativeFrom="column">
                 <wp:posOffset>-370205</wp:posOffset>
@@ -6678,8 +6640,8 @@
                       <wps:cNvSpPr/>
                       <wps:spPr>
                         <a:xfrm>
-                          <a:off x="5176440" y="543600"/>
-                          <a:ext cx="1828080" cy="405000"/>
+                          <a:off x="5176440" y="544680"/>
+                          <a:ext cx="1827000" cy="403920"/>
                         </a:xfrm>
                         <a:prstGeom prst="rect">
                           <a:avLst/>
@@ -6721,7 +6683,7 @@
                                 <w:u w:val="none"/>
                                 <w:b/>
                                 <w:sz w:val="18"/>
-                                <w:rFonts w:ascii="Calibri" w:hAnsi="Calibri" w:eastAsia="Calibri" w:cs="Calibri"/>
+                                <w:rFonts w:eastAsia="Calibri" w:cs="Calibri" w:ascii="Calibri" w:hAnsi="Calibri"/>
                                 <w:color w:val="004494"/>
                                 <w:lang w:eastAsia="fr-CM" w:val="fr-FR"/>
                               </w:rPr>
@@ -6752,7 +6714,7 @@
                                 <w:u w:val="none"/>
                                 <w:b w:val="false"/>
                                 <w:sz w:val="18"/>
-                                <w:rFonts w:ascii="Calibri" w:hAnsi="Calibri" w:eastAsia="Calibri" w:cs="Calibri"/>
+                                <w:rFonts w:eastAsia="Calibri" w:cs="Calibri" w:ascii="Calibri" w:hAnsi="Calibri"/>
                                 <w:color w:val="004494"/>
                                 <w:lang w:eastAsia="fr-CM" w:val="fr-FR"/>
                               </w:rPr>
@@ -6761,7 +6723,7 @@
                           </w:p>
                         </w:txbxContent>
                       </wps:txbx>
-                      <wps:bodyPr tIns="161280" bIns="161280" anchor="t" upright="1">
+                      <wps:bodyPr lIns="90000" rIns="90000" tIns="405360" bIns="405360" anchor="t" upright="1">
                         <a:noAutofit/>
                       </wps:bodyPr>
                     </wps:wsp>
@@ -6770,7 +6732,7 @@
                       <wps:spPr>
                         <a:xfrm>
                           <a:off x="746640" y="442080"/>
-                          <a:ext cx="1112040" cy="487800"/>
+                          <a:ext cx="1110600" cy="487800"/>
                         </a:xfrm>
                         <a:prstGeom prst="rect">
                           <a:avLst/>
@@ -6797,12 +6759,12 @@
                             </w:pPr>
                             <w:r>
                               <w:rPr>
-                                <w:spacing w:val="0"/>
                                 <w:smallCaps w:val="false"/>
                                 <w:caps w:val="false"/>
                                 <w:iCs w:val="false"/>
                                 <w:bCs w:val="false"/>
                                 <w:szCs w:val="16"/>
+                                <w:spacing w:val="0"/>
                                 <w:vertAlign w:val="baseline"/>
                                 <w:position w:val="0"/>
                                 <w:sz w:val="16"/>
@@ -6814,7 +6776,7 @@
                                 <w:sz w:val="16"/>
                                 <w:rFonts w:eastAsia="Calibri" w:ascii="Eras Bold ITC" w:hAnsi="Eras Bold ITC"/>
                                 <w:color w:val="060060"/>
-                                <w:lang w:val="fr-CM" w:eastAsia="fr-CM"/>
+                                <w:lang w:eastAsia="fr-CM" w:val="fr-CM"/>
                               </w:rPr>
                               <w:t>ELECTRICITY</w:t>
                             </w:r>
@@ -6828,12 +6790,12 @@
                             </w:pPr>
                             <w:r>
                               <w:rPr>
-                                <w:spacing w:val="0"/>
                                 <w:smallCaps w:val="false"/>
                                 <w:caps w:val="false"/>
                                 <w:iCs w:val="false"/>
                                 <w:bCs w:val="false"/>
                                 <w:szCs w:val="16"/>
+                                <w:spacing w:val="0"/>
                                 <w:vertAlign w:val="baseline"/>
                                 <w:position w:val="0"/>
                                 <w:sz w:val="16"/>
@@ -6845,7 +6807,7 @@
                                 <w:sz w:val="16"/>
                                 <w:rFonts w:eastAsia="Calibri" w:ascii="Eras Bold ITC" w:hAnsi="Eras Bold ITC"/>
                                 <w:color w:val="060060"/>
-                                <w:lang w:val="fr-CM" w:eastAsia="fr-CM"/>
+                                <w:lang w:eastAsia="fr-CM" w:val="fr-CM"/>
                               </w:rPr>
                               <w:t>DEVELOPMENT</w:t>
                             </w:r>
@@ -6859,12 +6821,12 @@
                             </w:pPr>
                             <w:r>
                               <w:rPr>
-                                <w:spacing w:val="0"/>
                                 <w:smallCaps w:val="false"/>
                                 <w:caps w:val="false"/>
                                 <w:iCs w:val="false"/>
                                 <w:bCs w:val="false"/>
                                 <w:szCs w:val="16"/>
+                                <w:spacing w:val="0"/>
                                 <w:vertAlign w:val="baseline"/>
                                 <w:position w:val="0"/>
                                 <w:sz w:val="16"/>
@@ -6876,14 +6838,14 @@
                                 <w:sz w:val="16"/>
                                 <w:rFonts w:eastAsia="Calibri" w:ascii="Eras Bold ITC" w:hAnsi="Eras Bold ITC"/>
                                 <w:color w:val="060060"/>
-                                <w:lang w:val="fr-CM" w:eastAsia="fr-CM"/>
+                                <w:lang w:eastAsia="fr-CM" w:val="fr-CM"/>
                               </w:rPr>
                               <w:t>CORPORATION</w:t>
                             </w:r>
                           </w:p>
                         </w:txbxContent>
                       </wps:txbx>
-                      <wps:bodyPr tIns="80640" bIns="80640" anchor="t" upright="1">
+                      <wps:bodyPr lIns="90000" rIns="90000" tIns="487440" bIns="487440" anchor="t" upright="1">
                         <a:noAutofit/>
                       </wps:bodyPr>
                     </wps:wsp>
@@ -6899,7 +6861,7 @@
                       <pic:spPr>
                         <a:xfrm>
                           <a:off x="0" y="0"/>
-                          <a:ext cx="794520" cy="906840"/>
+                          <a:ext cx="793080" cy="906840"/>
                         </a:xfrm>
                         <a:prstGeom prst="rect">
                           <a:avLst/>
@@ -6913,8 +6875,8 @@
                       <wps:cNvSpPr/>
                       <wps:spPr>
                         <a:xfrm rot="10800000">
-                          <a:off x="3172320" y="894240"/>
-                          <a:ext cx="3989160" cy="720"/>
+                          <a:off x="3173760" y="895320"/>
+                          <a:ext cx="3987720" cy="720"/>
                         </a:xfrm>
                         <a:prstGeom prst="straightConnector1">
                           <a:avLst/>
@@ -6943,8 +6905,8 @@
         </mc:Choice>
         <mc:Fallback>
           <w:pict>
-            <v:group id="shape_0" alt="Group 18" style="position:absolute;margin-left:-29.15pt;margin-top:-23.75pt;width:563.85pt;height:74.7pt" coordorigin="-583,-475" coordsize="11277,1494">
-              <v:rect id="shape_0" ID="Text Box 8" path="m0,0l-2147483645,0l-2147483645,-2147483646l0,-2147483646xe" stroked="f" o:allowincell="f" style="position:absolute;left:7569;top:381;width:2878;height:637;mso-wrap-style:square;v-text-anchor:top">
+            <v:group id="shape_0" alt="Group 18" style="position:absolute;margin-left:-29.15pt;margin-top:-23.75pt;width:563.85pt;height:74.65pt" coordorigin="-583,-475" coordsize="11277,1493">
+              <v:rect id="shape_0" path="m0,0l-2147483645,0l-2147483645,-2147483646l0,-2147483646xe" stroked="f" o:allowincell="f" style="position:absolute;left:7569;top:383;width:2876;height:635;mso-wrap-style:square;v-text-anchor:top">
                 <v:textbox>
                   <w:txbxContent>
                     <w:p>
@@ -6971,7 +6933,7 @@
                           <w:u w:val="none"/>
                           <w:b/>
                           <w:sz w:val="18"/>
-                          <w:rFonts w:ascii="Calibri" w:hAnsi="Calibri" w:eastAsia="Calibri" w:cs="Calibri"/>
+                          <w:rFonts w:eastAsia="Calibri" w:cs="Calibri" w:ascii="Calibri" w:hAnsi="Calibri"/>
                           <w:color w:val="004494"/>
                           <w:lang w:eastAsia="fr-CM" w:val="fr-FR"/>
                         </w:rPr>
@@ -7002,7 +6964,7 @@
                           <w:u w:val="none"/>
                           <w:b w:val="false"/>
                           <w:sz w:val="18"/>
-                          <w:rFonts w:ascii="Calibri" w:hAnsi="Calibri" w:eastAsia="Calibri" w:cs="Calibri"/>
+                          <w:rFonts w:eastAsia="Calibri" w:cs="Calibri" w:ascii="Calibri" w:hAnsi="Calibri"/>
                           <w:color w:val="004494"/>
                           <w:lang w:eastAsia="fr-CM" w:val="fr-FR"/>
                         </w:rPr>
@@ -7015,7 +6977,7 @@
                 <v:stroke color="#3465a4" joinstyle="round" endcap="flat"/>
                 <w10:wrap type="none"/>
               </v:rect>
-              <v:rect id="shape_0" ID="Text Box 9" path="m0,0l-2147483645,0l-2147483645,-2147483646l0,-2147483646xe" stroked="f" o:allowincell="f" style="position:absolute;left:593;top:221;width:1750;height:767;mso-wrap-style:square;v-text-anchor:top">
+              <v:rect id="shape_0" path="m0,0l-2147483645,0l-2147483645,-2147483646l0,-2147483646xe" stroked="f" o:allowincell="f" style="position:absolute;left:593;top:221;width:1748;height:767;mso-wrap-style:square;v-text-anchor:top">
                 <v:textbox>
                   <w:txbxContent>
                     <w:p>
@@ -7027,12 +6989,12 @@
                       </w:pPr>
                       <w:r>
                         <w:rPr>
-                          <w:spacing w:val="0"/>
                           <w:smallCaps w:val="false"/>
                           <w:caps w:val="false"/>
                           <w:iCs w:val="false"/>
                           <w:bCs w:val="false"/>
                           <w:szCs w:val="16"/>
+                          <w:spacing w:val="0"/>
                           <w:vertAlign w:val="baseline"/>
                           <w:position w:val="0"/>
                           <w:sz w:val="16"/>
@@ -7044,7 +7006,7 @@
                           <w:sz w:val="16"/>
                           <w:rFonts w:eastAsia="Calibri" w:ascii="Eras Bold ITC" w:hAnsi="Eras Bold ITC"/>
                           <w:color w:val="060060"/>
-                          <w:lang w:val="fr-CM" w:eastAsia="fr-CM"/>
+                          <w:lang w:eastAsia="fr-CM" w:val="fr-CM"/>
                         </w:rPr>
                         <w:t>ELECTRICITY</w:t>
                       </w:r>
@@ -7058,12 +7020,12 @@
                       </w:pPr>
                       <w:r>
                         <w:rPr>
-                          <w:spacing w:val="0"/>
                           <w:smallCaps w:val="false"/>
                           <w:caps w:val="false"/>
                           <w:iCs w:val="false"/>
                           <w:bCs w:val="false"/>
                           <w:szCs w:val="16"/>
+                          <w:spacing w:val="0"/>
                           <w:vertAlign w:val="baseline"/>
                           <w:position w:val="0"/>
                           <w:sz w:val="16"/>
@@ -7075,7 +7037,7 @@
                           <w:sz w:val="16"/>
                           <w:rFonts w:eastAsia="Calibri" w:ascii="Eras Bold ITC" w:hAnsi="Eras Bold ITC"/>
                           <w:color w:val="060060"/>
-                          <w:lang w:val="fr-CM" w:eastAsia="fr-CM"/>
+                          <w:lang w:eastAsia="fr-CM" w:val="fr-CM"/>
                         </w:rPr>
                         <w:t>DEVELOPMENT</w:t>
                       </w:r>
@@ -7089,12 +7051,12 @@
                       </w:pPr>
                       <w:r>
                         <w:rPr>
-                          <w:spacing w:val="0"/>
                           <w:smallCaps w:val="false"/>
                           <w:caps w:val="false"/>
                           <w:iCs w:val="false"/>
                           <w:bCs w:val="false"/>
                           <w:szCs w:val="16"/>
+                          <w:spacing w:val="0"/>
                           <w:vertAlign w:val="baseline"/>
                           <w:position w:val="0"/>
                           <w:sz w:val="16"/>
@@ -7106,7 +7068,7 @@
                           <w:sz w:val="16"/>
                           <w:rFonts w:eastAsia="Calibri" w:ascii="Eras Bold ITC" w:hAnsi="Eras Bold ITC"/>
                           <w:color w:val="060060"/>
-                          <w:lang w:val="fr-CM" w:eastAsia="fr-CM"/>
+                          <w:lang w:eastAsia="fr-CM" w:val="fr-CM"/>
                         </w:rPr>
                         <w:t>CORPORATION</w:t>
                       </w:r>
@@ -7136,7 +7098,7 @@
                 <v:path o:extrusionok="f" gradientshapeok="t" o:connecttype="rect"/>
                 <o:lock v:ext="edit" aspectratio="t"/>
               </v:shapetype>
-              <v:shape id="shape_0" ID="Picture 10" stroked="f" o:allowincell="f" style="position:absolute;left:-583;top:-475;width:1250;height:1427;mso-wrap-style:none;v-text-anchor:middle" type="_x0000_t75">
+              <v:shape id="shape_0" ID="Picture 10" stroked="f" o:allowincell="f" style="position:absolute;left:-583;top:-475;width:1248;height:1427;mso-wrap-style:none;v-text-anchor:middle" type="_x0000_t75">
                 <v:imagedata r:id="rId1" o:detectmouseclick="t"/>
                 <v:stroke color="#3465a4" joinstyle="round" endcap="flat"/>
                 <w10:wrap type="none"/>
@@ -7145,7 +7107,7 @@
                 <v:stroke joinstyle="miter"/>
                 <v:path gradientshapeok="t" o:connecttype="rect" textboxrect="0,0,21600,21600"/>
               </v:shapetype>
-              <v:shape id="shape_0" ID="AutoShape 11" stroked="t" o:allowincell="f" style="position:absolute;left:4413;top:933;width:6281;height:0;mso-wrap-style:none;v-text-anchor:middle;rotation:180" type="_x0000_t32">
+              <v:shape id="shape_0" stroked="t" o:allowincell="f" style="position:absolute;left:4415;top:935;width:6279;height:0;mso-wrap-style:none;v-text-anchor:middle;rotation:180" type="_x0000_t32">
                 <v:fill o:detectmouseclick="t" on="false"/>
                 <v:stroke color="#ed9100" weight="3240" joinstyle="round" endcap="flat"/>
                 <w10:wrap type="none"/>
@@ -7558,6 +7520,7 @@
     <w:rsid w:val="003369b5"/>
     <w:pPr>
       <w:widowControl/>
+      <w:suppressAutoHyphens w:val="true"/>
       <w:bidi w:val="0"/>
       <w:spacing w:before="0" w:after="0"/>
       <w:jc w:val="left"/>

</xml_diff>